<commit_message>
work review so far
</commit_message>
<xml_diff>
--- a/work-review.docx
+++ b/work-review.docx
@@ -203,25 +203,7 @@
           <w:sz w:val="20"/>
           <w:szCs w:val="20"/>
         </w:rPr>
-        <w:t xml:space="preserve"> we d</w:t>
-      </w:r>
-      <w:r>
-        <w:rPr>
-          <w:rFonts w:cs="Helvetica Neue"/>
-          <w:kern w:val="0"/>
-          <w:sz w:val="20"/>
-          <w:szCs w:val="20"/>
-        </w:rPr>
-        <w:t>efined</w:t>
-      </w:r>
-      <w:r>
-        <w:rPr>
-          <w:rFonts w:cs="Helvetica Neue"/>
-          <w:kern w:val="0"/>
-          <w:sz w:val="20"/>
-          <w:szCs w:val="20"/>
-        </w:rPr>
-        <w:t>:</w:t>
+        <w:t xml:space="preserve"> we defined:</w:t>
       </w:r>
       <w:r>
         <w:rPr>
@@ -273,6 +255,15 @@
           <w:szCs w:val="20"/>
         </w:rPr>
       </w:pPr>
+      <w:r>
+        <w:rPr>
+          <w:rFonts w:cs="Helvetica Neue"/>
+          <w:kern w:val="0"/>
+          <w:sz w:val="20"/>
+          <w:szCs w:val="20"/>
+        </w:rPr>
+        <w:t>```CODE</w:t>
+      </w:r>
     </w:p>
     <w:p>
       <w:pPr>
@@ -1087,6 +1078,29 @@
           <w:szCs w:val="20"/>
         </w:rPr>
         <w:t>})</w:t>
+      </w:r>
+    </w:p>
+    <w:p>
+      <w:pPr>
+        <w:autoSpaceDE w:val="0"/>
+        <w:autoSpaceDN w:val="0"/>
+        <w:adjustRightInd w:val="0"/>
+        <w:spacing w:after="0" w:line="240" w:lineRule="auto"/>
+        <w:rPr>
+          <w:rFonts w:cs="Helvetica Neue"/>
+          <w:kern w:val="0"/>
+          <w:sz w:val="20"/>
+          <w:szCs w:val="20"/>
+        </w:rPr>
+      </w:pPr>
+      <w:r>
+        <w:rPr>
+          <w:rFonts w:cs="Helvetica Neue"/>
+          <w:kern w:val="0"/>
+          <w:sz w:val="20"/>
+          <w:szCs w:val="20"/>
+        </w:rPr>
+        <w:t>```</w:t>
       </w:r>
     </w:p>
     <w:p>
@@ -1723,12 +1737,6 @@
         <w:gridCol w:w="2880"/>
       </w:tblGrid>
       <w:tr>
-        <w:tblPrEx>
-          <w:tblCellMar>
-            <w:top w:w="0" w:type="dxa"/>
-            <w:bottom w:w="0" w:type="dxa"/>
-          </w:tblCellMar>
-        </w:tblPrEx>
         <w:tc>
           <w:tcPr>
             <w:tcW w:w="2988" w:type="dxa"/>
@@ -1873,10 +1881,6 @@
           <w:tblBorders>
             <w:top w:val="none" w:sz="0" w:space="0" w:color="auto"/>
           </w:tblBorders>
-          <w:tblCellMar>
-            <w:top w:w="0" w:type="dxa"/>
-            <w:bottom w:w="0" w:type="dxa"/>
-          </w:tblCellMar>
         </w:tblPrEx>
         <w:tc>
           <w:tcPr>
@@ -2006,10 +2010,6 @@
           <w:tblBorders>
             <w:top w:val="none" w:sz="0" w:space="0" w:color="auto"/>
           </w:tblBorders>
-          <w:tblCellMar>
-            <w:top w:w="0" w:type="dxa"/>
-            <w:bottom w:w="0" w:type="dxa"/>
-          </w:tblCellMar>
         </w:tblPrEx>
         <w:tc>
           <w:tcPr>
@@ -2139,10 +2139,6 @@
           <w:tblBorders>
             <w:top w:val="none" w:sz="0" w:space="0" w:color="auto"/>
           </w:tblBorders>
-          <w:tblCellMar>
-            <w:top w:w="0" w:type="dxa"/>
-            <w:bottom w:w="0" w:type="dxa"/>
-          </w:tblCellMar>
         </w:tblPrEx>
         <w:tc>
           <w:tcPr>
@@ -2272,10 +2268,6 @@
           <w:tblBorders>
             <w:top w:val="none" w:sz="0" w:space="0" w:color="auto"/>
           </w:tblBorders>
-          <w:tblCellMar>
-            <w:top w:w="0" w:type="dxa"/>
-            <w:bottom w:w="0" w:type="dxa"/>
-          </w:tblCellMar>
         </w:tblPrEx>
         <w:tc>
           <w:tcPr>
@@ -2399,12 +2391,6 @@
         </w:tc>
       </w:tr>
       <w:tr>
-        <w:tblPrEx>
-          <w:tblCellMar>
-            <w:top w:w="0" w:type="dxa"/>
-            <w:bottom w:w="0" w:type="dxa"/>
-          </w:tblCellMar>
-        </w:tblPrEx>
         <w:tc>
           <w:tcPr>
             <w:tcW w:w="2988" w:type="dxa"/>
@@ -2529,12 +2515,6 @@
         </w:tc>
       </w:tr>
       <w:tr>
-        <w:tblPrEx>
-          <w:tblCellMar>
-            <w:top w:w="0" w:type="dxa"/>
-            <w:bottom w:w="0" w:type="dxa"/>
-          </w:tblCellMar>
-        </w:tblPrEx>
         <w:tc>
           <w:tcPr>
             <w:tcW w:w="2988" w:type="dxa"/>
@@ -2571,6 +2551,7 @@
                 <w:sz w:val="20"/>
                 <w:szCs w:val="20"/>
               </w:rPr>
+              <w:lastRenderedPageBreak/>
               <w:t>serve</w:t>
             </w:r>
           </w:p>
@@ -2657,12 +2638,6 @@
         </w:tc>
       </w:tr>
       <w:tr>
-        <w:tblPrEx>
-          <w:tblCellMar>
-            <w:top w:w="0" w:type="dxa"/>
-            <w:bottom w:w="0" w:type="dxa"/>
-          </w:tblCellMar>
-        </w:tblPrEx>
         <w:tc>
           <w:tcPr>
             <w:tcW w:w="2988" w:type="dxa"/>
@@ -2699,7 +2674,6 @@
                 <w:sz w:val="20"/>
                 <w:szCs w:val="20"/>
               </w:rPr>
-              <w:lastRenderedPageBreak/>
               <w:t>ray</w:t>
             </w:r>
           </w:p>
@@ -2786,12 +2760,6 @@
         </w:tc>
       </w:tr>
       <w:tr>
-        <w:tblPrEx>
-          <w:tblCellMar>
-            <w:top w:w="0" w:type="dxa"/>
-            <w:bottom w:w="0" w:type="dxa"/>
-          </w:tblCellMar>
-        </w:tblPrEx>
         <w:tc>
           <w:tcPr>
             <w:tcW w:w="2988" w:type="dxa"/>
@@ -3208,6 +3176,15 @@
         </w:rPr>
         <w:t>```</w:t>
       </w:r>
+      <w:r>
+        <w:rPr>
+          <w:rFonts w:cs="Helvetica Neue"/>
+          <w:kern w:val="0"/>
+          <w:sz w:val="20"/>
+          <w:szCs w:val="20"/>
+        </w:rPr>
+        <w:t>CODE</w:t>
+      </w:r>
     </w:p>
     <w:p>
       <w:pPr>
@@ -4134,19 +4111,8 @@
           <w:sz w:val="20"/>
           <w:szCs w:val="20"/>
         </w:rPr>
-        <w:t xml:space="preserve"> and Final to make query tuning and fallback limits explicit, reproducible, and logged in </w:t>
-      </w:r>
-      <w:proofErr w:type="spellStart"/>
-      <w:r>
-        <w:rPr>
-          <w:rFonts w:cs="Helvetica Neue"/>
-          <w:kern w:val="0"/>
-          <w:sz w:val="20"/>
-          <w:szCs w:val="20"/>
-        </w:rPr>
-        <w:t>run_manifest.json</w:t>
-      </w:r>
-      <w:proofErr w:type="spellEnd"/>
+        <w:t xml:space="preserve"> and Final to make query tuning and fallback limits explicit, reproducible, and logged in run_manifest.json</w:t>
+      </w:r>
     </w:p>
     <w:p>
       <w:pPr>
@@ -4701,11 +4667,14 @@
           <w:sz w:val="20"/>
           <w:szCs w:val="20"/>
         </w:rPr>
-        <w:t>`. This adds an optional full replacement of the query list for an anchor. None of the current JSON entries use it, but the hook exists for future `only run these cases scenarios`.</w:t>
-      </w:r>
-    </w:p>
-    <w:p>
-      <w:pPr>
+        <w:t xml:space="preserve">`. </w:t>
+      </w:r>
+    </w:p>
+    <w:p>
+      <w:pPr>
+        <w:pBdr>
+          <w:bottom w:val="single" w:sz="6" w:space="1" w:color="auto"/>
+        </w:pBdr>
         <w:autoSpaceDE w:val="0"/>
         <w:autoSpaceDN w:val="0"/>
         <w:adjustRightInd w:val="0"/>
@@ -4725,6 +4694,133 @@
           <w:szCs w:val="20"/>
         </w:rPr>
         <w:lastRenderedPageBreak/>
+        <w:t xml:space="preserve">This adds an optional full replacement of the query list for an anchor. </w:t>
+      </w:r>
+    </w:p>
+    <w:p>
+      <w:pPr>
+        <w:pBdr>
+          <w:bottom w:val="single" w:sz="6" w:space="1" w:color="auto"/>
+        </w:pBdr>
+        <w:autoSpaceDE w:val="0"/>
+        <w:autoSpaceDN w:val="0"/>
+        <w:adjustRightInd w:val="0"/>
+        <w:spacing w:after="0" w:line="240" w:lineRule="auto"/>
+        <w:rPr>
+          <w:rFonts w:cs="Helvetica Neue"/>
+          <w:kern w:val="0"/>
+          <w:sz w:val="20"/>
+          <w:szCs w:val="20"/>
+        </w:rPr>
+      </w:pPr>
+      <w:r>
+        <w:rPr>
+          <w:rFonts w:cs="Helvetica Neue"/>
+          <w:kern w:val="0"/>
+          <w:sz w:val="20"/>
+          <w:szCs w:val="20"/>
+        </w:rPr>
+        <w:t>None of the current JSON entries use it, but the hook exists for future</w:t>
+      </w:r>
+      <w:r>
+        <w:rPr>
+          <w:rFonts w:cs="Helvetica Neue"/>
+          <w:kern w:val="0"/>
+          <w:sz w:val="20"/>
+          <w:szCs w:val="20"/>
+        </w:rPr>
+        <w:t xml:space="preserve"> ‘</w:t>
+      </w:r>
+      <w:r>
+        <w:rPr>
+          <w:rFonts w:cs="Helvetica Neue"/>
+          <w:kern w:val="0"/>
+          <w:sz w:val="20"/>
+          <w:szCs w:val="20"/>
+        </w:rPr>
+        <w:t xml:space="preserve">only run these cases </w:t>
+      </w:r>
+      <w:proofErr w:type="gramStart"/>
+      <w:r>
+        <w:rPr>
+          <w:rFonts w:cs="Helvetica Neue"/>
+          <w:kern w:val="0"/>
+          <w:sz w:val="20"/>
+          <w:szCs w:val="20"/>
+        </w:rPr>
+        <w:t>scenarios</w:t>
+      </w:r>
+      <w:r>
+        <w:rPr>
+          <w:rFonts w:cs="Helvetica Neue"/>
+          <w:kern w:val="0"/>
+          <w:sz w:val="20"/>
+          <w:szCs w:val="20"/>
+        </w:rPr>
+        <w:t>’</w:t>
+      </w:r>
+      <w:proofErr w:type="gramEnd"/>
+      <w:r>
+        <w:rPr>
+          <w:rFonts w:cs="Helvetica Neue"/>
+          <w:kern w:val="0"/>
+          <w:sz w:val="20"/>
+          <w:szCs w:val="20"/>
+        </w:rPr>
+        <w:t>.</w:t>
+      </w:r>
+    </w:p>
+    <w:p>
+      <w:pPr>
+        <w:pBdr>
+          <w:bottom w:val="single" w:sz="6" w:space="1" w:color="auto"/>
+        </w:pBdr>
+        <w:autoSpaceDE w:val="0"/>
+        <w:autoSpaceDN w:val="0"/>
+        <w:adjustRightInd w:val="0"/>
+        <w:spacing w:after="0" w:line="240" w:lineRule="auto"/>
+        <w:rPr>
+          <w:rFonts w:cs="Helvetica Neue"/>
+          <w:kern w:val="0"/>
+          <w:sz w:val="20"/>
+          <w:szCs w:val="20"/>
+        </w:rPr>
+      </w:pPr>
+    </w:p>
+    <w:p>
+      <w:pPr>
+        <w:autoSpaceDE w:val="0"/>
+        <w:autoSpaceDN w:val="0"/>
+        <w:adjustRightInd w:val="0"/>
+        <w:spacing w:after="0" w:line="240" w:lineRule="auto"/>
+        <w:rPr>
+          <w:rFonts w:cs="Helvetica Neue"/>
+          <w:kern w:val="0"/>
+          <w:sz w:val="20"/>
+          <w:szCs w:val="20"/>
+        </w:rPr>
+      </w:pPr>
+    </w:p>
+    <w:p>
+      <w:pPr>
+        <w:autoSpaceDE w:val="0"/>
+        <w:autoSpaceDN w:val="0"/>
+        <w:adjustRightInd w:val="0"/>
+        <w:spacing w:after="0" w:line="240" w:lineRule="auto"/>
+        <w:rPr>
+          <w:rFonts w:cs="Helvetica Neue"/>
+          <w:kern w:val="0"/>
+          <w:sz w:val="20"/>
+          <w:szCs w:val="20"/>
+        </w:rPr>
+      </w:pPr>
+      <w:r>
+        <w:rPr>
+          <w:rFonts w:cs="Helvetica Neue"/>
+          <w:kern w:val="0"/>
+          <w:sz w:val="20"/>
+          <w:szCs w:val="20"/>
+        </w:rPr>
         <w:t>`</w:t>
       </w:r>
       <w:proofErr w:type="spellStart"/>
@@ -4840,6 +4936,15 @@
           <w:szCs w:val="20"/>
         </w:rPr>
         <w:t>```</w:t>
+      </w:r>
+      <w:r>
+        <w:rPr>
+          <w:rFonts w:cs="Helvetica Neue"/>
+          <w:kern w:val="0"/>
+          <w:sz w:val="20"/>
+          <w:szCs w:val="20"/>
+        </w:rPr>
+        <w:t>CODE</w:t>
       </w:r>
     </w:p>
     <w:p>
@@ -7257,6 +7362,7 @@
           <w:sz w:val="20"/>
           <w:szCs w:val="20"/>
         </w:rPr>
+        <w:lastRenderedPageBreak/>
         <w:t xml:space="preserve">With penalty 300, min score 700 </w:t>
       </w:r>
       <w:r>
@@ -8173,16 +8279,7 @@
           <w:sz w:val="20"/>
           <w:szCs w:val="20"/>
         </w:rPr>
-        <w:t xml:space="preserve">Serve = </w:t>
-      </w:r>
-      <w:r>
-        <w:rPr>
-          <w:rFonts w:cs="Helvetica Neue"/>
-          <w:kern w:val="0"/>
-          <w:sz w:val="20"/>
-          <w:szCs w:val="20"/>
-        </w:rPr>
-        <w:t>3</w:t>
+        <w:t>Serve = 3</w:t>
       </w:r>
     </w:p>
     <w:p>

</xml_diff>